<commit_message>
Add grid drag and drop in desktop
</commit_message>
<xml_diff>
--- a/Projet.docx
+++ b/Projet.docx
@@ -631,29 +631,6 @@
           <w:szCs w:val="28"/>
           <w:lang w:val="af-ZA"/>
         </w:rPr>
-        <w:t>Mongo DB</w:t>
-      </w:r>
-    </w:p>
-    <w:p>
-      <w:pPr>
-        <w:pStyle w:val="Paragraphedeliste"/>
-        <w:numPr>
-          <w:ilvl w:val="0"/>
-          <w:numId w:val="1"/>
-        </w:numPr>
-        <w:jc w:val="both"/>
-        <w:rPr>
-          <w:sz w:val="28"/>
-          <w:szCs w:val="28"/>
-          <w:lang w:val="af-ZA"/>
-        </w:rPr>
-      </w:pPr>
-      <w:r>
-        <w:rPr>
-          <w:sz w:val="28"/>
-          <w:szCs w:val="28"/>
-          <w:lang w:val="af-ZA"/>
-        </w:rPr>
         <w:t>Indexed DB</w:t>
       </w:r>
     </w:p>
@@ -677,30 +654,30 @@
           <w:szCs w:val="28"/>
           <w:lang w:val="af-ZA"/>
         </w:rPr>
-        <w:t>Tailwind CSS</w:t>
-      </w:r>
-    </w:p>
-    <w:p>
-      <w:pPr>
-        <w:pStyle w:val="Paragraphedeliste"/>
-        <w:numPr>
-          <w:ilvl w:val="0"/>
-          <w:numId w:val="1"/>
-        </w:numPr>
-        <w:jc w:val="both"/>
-        <w:rPr>
-          <w:sz w:val="28"/>
-          <w:szCs w:val="28"/>
-          <w:lang w:val="af-ZA"/>
-        </w:rPr>
-      </w:pPr>
-      <w:r>
-        <w:rPr>
-          <w:sz w:val="28"/>
-          <w:szCs w:val="28"/>
-          <w:lang w:val="af-ZA"/>
-        </w:rPr>
-        <w:t>Drag and drop</w:t>
+        <w:t>Dnd-kit</w:t>
+      </w:r>
+    </w:p>
+    <w:p>
+      <w:pPr>
+        <w:pStyle w:val="Paragraphedeliste"/>
+        <w:numPr>
+          <w:ilvl w:val="0"/>
+          <w:numId w:val="1"/>
+        </w:numPr>
+        <w:jc w:val="both"/>
+        <w:rPr>
+          <w:sz w:val="28"/>
+          <w:szCs w:val="28"/>
+          <w:lang w:val="af-ZA"/>
+        </w:rPr>
+      </w:pPr>
+      <w:r>
+        <w:rPr>
+          <w:sz w:val="28"/>
+          <w:szCs w:val="28"/>
+          <w:lang w:val="af-ZA"/>
+        </w:rPr>
+        <w:t>FontAwesome</w:t>
       </w:r>
     </w:p>
     <w:p>
@@ -2826,6 +2803,29 @@
     <w:p>
       <w:pPr>
         <w:pStyle w:val="Paragraphedeliste"/>
+        <w:numPr>
+          <w:ilvl w:val="1"/>
+          <w:numId w:val="1"/>
+        </w:numPr>
+        <w:jc w:val="both"/>
+        <w:rPr>
+          <w:sz w:val="28"/>
+          <w:szCs w:val="28"/>
+          <w:lang w:val="af-ZA"/>
+        </w:rPr>
+      </w:pPr>
+      <w:r>
+        <w:rPr>
+          <w:sz w:val="24"/>
+          <w:szCs w:val="24"/>
+          <w:lang w:val="af-ZA"/>
+        </w:rPr>
+        <w:t>Grille drag and drop</w:t>
+      </w:r>
+    </w:p>
+    <w:p>
+      <w:pPr>
+        <w:pStyle w:val="Paragraphedeliste"/>
         <w:ind w:left="1440"/>
         <w:jc w:val="both"/>
         <w:rPr>
@@ -2878,7 +2878,7 @@
           <w:szCs w:val="24"/>
           <w:lang w:val="af-ZA"/>
         </w:rPr>
-        <w:t>Home</w:t>
+        <w:t>Index</w:t>
       </w:r>
     </w:p>
     <w:p>
@@ -3211,6 +3211,14 @@
           <w:lang w:val="af-ZA"/>
         </w:rPr>
         <w:t>Record de temps sur demineur</w:t>
+      </w:r>
+      <w:r>
+        <w:rPr>
+          <w:sz w:val="24"/>
+          <w:szCs w:val="24"/>
+          <w:lang w:val="af-ZA"/>
+        </w:rPr>
+        <w:t xml:space="preserve"> </w:t>
       </w:r>
     </w:p>
     <w:p>

</xml_diff>

<commit_message>
Add a lot of thing
</commit_message>
<xml_diff>
--- a/Projet.docx
+++ b/Projet.docx
@@ -1,6 +1,6 @@
 
 <file path=word/document.xml><?xml version="1.0" encoding="utf-8"?>
-<w:document xmlns:wpc="http://schemas.microsoft.com/office/word/2010/wordprocessingCanvas" xmlns:cx="http://schemas.microsoft.com/office/drawing/2014/chartex" xmlns:cx1="http://schemas.microsoft.com/office/drawing/2015/9/8/chartex" xmlns:cx2="http://schemas.microsoft.com/office/drawing/2015/10/21/chartex" xmlns:cx3="http://schemas.microsoft.com/office/drawing/2016/5/9/chartex" xmlns:cx4="http://schemas.microsoft.com/office/drawing/2016/5/10/chartex" xmlns:cx5="http://schemas.microsoft.com/office/drawing/2016/5/11/chartex" xmlns:cx6="http://schemas.microsoft.com/office/drawing/2016/5/12/chartex" xmlns:cx7="http://schemas.microsoft.com/office/drawing/2016/5/13/chartex" xmlns:cx8="http://schemas.microsoft.com/office/drawing/2016/5/14/chartex" xmlns:mc="http://schemas.openxmlformats.org/markup-compatibility/2006" xmlns:aink="http://schemas.microsoft.com/office/drawing/2016/ink" xmlns:am3d="http://schemas.microsoft.com/office/drawing/2017/model3d" xmlns:o="urn:schemas-microsoft-com:office:office" xmlns:oel="http://schemas.microsoft.com/office/2019/extlst" xmlns:r="http://schemas.openxmlformats.org/officeDocument/2006/relationships" xmlns:m="http://schemas.openxmlformats.org/officeDocument/2006/math" xmlns:v="urn:schemas-microsoft-com:vml" xmlns:wp14="http://schemas.microsoft.com/office/word/2010/wordprocessingDrawing" xmlns:wp="http://schemas.openxmlformats.org/drawingml/2006/wordprocessingDrawing" xmlns:w10="urn:schemas-microsoft-com:office:word" xmlns:w="http://schemas.openxmlformats.org/wordprocessingml/2006/main" xmlns:w14="http://schemas.microsoft.com/office/word/2010/wordml" xmlns:w15="http://schemas.microsoft.com/office/word/2012/wordml" xmlns:w16cex="http://schemas.microsoft.com/office/word/2018/wordml/cex" xmlns:w16cid="http://schemas.microsoft.com/office/word/2016/wordml/cid" xmlns:w16="http://schemas.microsoft.com/office/word/2018/wordml" xmlns:w16du="http://schemas.microsoft.com/office/word/2023/wordml/word16du" xmlns:w16sdtdh="http://schemas.microsoft.com/office/word/2020/wordml/sdtdatahash" xmlns:w16sdtfl="http://schemas.microsoft.com/office/word/2024/wordml/sdtformatlock" xmlns:w16se="http://schemas.microsoft.com/office/word/2015/wordml/symex" xmlns:wpg="http://schemas.microsoft.com/office/word/2010/wordprocessingGroup" xmlns:wpi="http://schemas.microsoft.com/office/word/2010/wordprocessingInk" xmlns:wne="http://schemas.microsoft.com/office/word/2006/wordml" xmlns:wps="http://schemas.microsoft.com/office/word/2010/wordprocessingShape" mc:Ignorable="w14 w15 w16se w16cid w16 w16cex w16sdtdh w16sdtfl w16du wp14">
+<w:document xmlns:wpc="http://schemas.microsoft.com/office/word/2010/wordprocessingCanvas" xmlns:cx="http://schemas.microsoft.com/office/drawing/2014/chartex" xmlns:cx1="http://schemas.microsoft.com/office/drawing/2015/9/8/chartex" xmlns:cx2="http://schemas.microsoft.com/office/drawing/2015/10/21/chartex" xmlns:cx3="http://schemas.microsoft.com/office/drawing/2016/5/9/chartex" xmlns:cx4="http://schemas.microsoft.com/office/drawing/2016/5/10/chartex" xmlns:cx5="http://schemas.microsoft.com/office/drawing/2016/5/11/chartex" xmlns:cx6="http://schemas.microsoft.com/office/drawing/2016/5/12/chartex" xmlns:cx7="http://schemas.microsoft.com/office/drawing/2016/5/13/chartex" xmlns:cx8="http://schemas.microsoft.com/office/drawing/2016/5/14/chartex" xmlns:mc="http://schemas.openxmlformats.org/markup-compatibility/2006" xmlns:aink="http://schemas.microsoft.com/office/drawing/2016/ink" xmlns:am3d="http://schemas.microsoft.com/office/drawing/2017/model3d" xmlns:o="urn:schemas-microsoft-com:office:office" xmlns:oel="http://schemas.microsoft.com/office/2019/extlst" xmlns:r="http://schemas.openxmlformats.org/officeDocument/2006/relationships" xmlns:m="http://schemas.openxmlformats.org/officeDocument/2006/math" xmlns:v="urn:schemas-microsoft-com:vml" xmlns:wp14="http://schemas.microsoft.com/office/word/2010/wordprocessingDrawing" xmlns:wp="http://schemas.openxmlformats.org/drawingml/2006/wordprocessingDrawing" xmlns:w10="urn:schemas-microsoft-com:office:word" xmlns:w="http://schemas.openxmlformats.org/wordprocessingml/2006/main" xmlns:w14="http://schemas.microsoft.com/office/word/2010/wordml" xmlns:w15="http://schemas.microsoft.com/office/word/2012/wordml" xmlns:w16cei="http://schemas.microsoft.com/office/word/2026/wordml/cei" xmlns:w16cex="http://schemas.microsoft.com/office/word/2018/wordml/cex" xmlns:w16cid="http://schemas.microsoft.com/office/word/2016/wordml/cid" xmlns:w16="http://schemas.microsoft.com/office/word/2018/wordml" xmlns:w16du="http://schemas.microsoft.com/office/word/2023/wordml/word16du" xmlns:w16sdtdh="http://schemas.microsoft.com/office/word/2020/wordml/sdtdatahash" xmlns:w16sdtfl="http://schemas.microsoft.com/office/word/2024/wordml/sdtformatlock" xmlns:w16se="http://schemas.microsoft.com/office/word/2015/wordml/symex" xmlns:wpg="http://schemas.microsoft.com/office/word/2010/wordprocessingGroup" xmlns:wpi="http://schemas.microsoft.com/office/word/2010/wordprocessingInk" xmlns:wne="http://schemas.microsoft.com/office/word/2006/wordml" xmlns:wps="http://schemas.microsoft.com/office/word/2010/wordprocessingShape" mc:Ignorable="w14 w15 w16se w16cid w16 w16cex w16sdtdh w16sdtfl w16du wp14">
   <w:body>
     <w:p>
       <w:pPr>
@@ -54,15 +54,25 @@
         <w:rPr>
           <w:sz w:val="28"/>
           <w:szCs w:val="28"/>
-        </w:rPr>
-      </w:pPr>
-      <w:r>
-        <w:rPr>
-          <w:sz w:val="28"/>
-          <w:szCs w:val="28"/>
+          <w:highlight w:val="yellow"/>
+        </w:rPr>
+      </w:pPr>
+      <w:r>
+        <w:rPr>
+          <w:sz w:val="28"/>
+          <w:szCs w:val="28"/>
+          <w:highlight w:val="yellow"/>
         </w:rPr>
         <w:t>Mode sombre</w:t>
       </w:r>
+      <w:r>
+        <w:rPr>
+          <w:sz w:val="28"/>
+          <w:szCs w:val="28"/>
+          <w:highlight w:val="yellow"/>
+        </w:rPr>
+        <w:t xml:space="preserve"> 5</w:t>
+      </w:r>
     </w:p>
     <w:p>
       <w:pPr>
@@ -159,15 +169,25 @@
         <w:rPr>
           <w:sz w:val="28"/>
           <w:szCs w:val="28"/>
-        </w:rPr>
-      </w:pPr>
-      <w:r>
-        <w:rPr>
-          <w:sz w:val="28"/>
-          <w:szCs w:val="28"/>
+          <w:highlight w:val="darkMagenta"/>
+        </w:rPr>
+      </w:pPr>
+      <w:r>
+        <w:rPr>
+          <w:sz w:val="28"/>
+          <w:szCs w:val="28"/>
+          <w:highlight w:val="darkMagenta"/>
         </w:rPr>
         <w:t>Terminal avec commandes</w:t>
       </w:r>
+      <w:r>
+        <w:rPr>
+          <w:sz w:val="28"/>
+          <w:szCs w:val="28"/>
+          <w:highlight w:val="darkMagenta"/>
+        </w:rPr>
+        <w:t xml:space="preserve"> 4</w:t>
+      </w:r>
     </w:p>
     <w:p>
       <w:pPr>
@@ -201,15 +221,25 @@
         <w:rPr>
           <w:sz w:val="28"/>
           <w:szCs w:val="28"/>
-        </w:rPr>
-      </w:pPr>
-      <w:r>
-        <w:rPr>
-          <w:sz w:val="28"/>
-          <w:szCs w:val="28"/>
+          <w:highlight w:val="yellow"/>
+        </w:rPr>
+      </w:pPr>
+      <w:r>
+        <w:rPr>
+          <w:sz w:val="28"/>
+          <w:szCs w:val="28"/>
+          <w:highlight w:val="yellow"/>
         </w:rPr>
         <w:t>Liseuse d’image</w:t>
       </w:r>
+      <w:r>
+        <w:rPr>
+          <w:sz w:val="28"/>
+          <w:szCs w:val="28"/>
+          <w:highlight w:val="yellow"/>
+        </w:rPr>
+        <w:t xml:space="preserve"> ou app portefolio ou les 2 3</w:t>
+      </w:r>
     </w:p>
     <w:p>
       <w:pPr>
@@ -222,14 +252,24 @@
         <w:rPr>
           <w:sz w:val="28"/>
           <w:szCs w:val="28"/>
-        </w:rPr>
-      </w:pPr>
-      <w:r>
-        <w:rPr>
-          <w:sz w:val="28"/>
-          <w:szCs w:val="28"/>
-        </w:rPr>
-        <w:t>Lecture de musique</w:t>
+          <w:highlight w:val="yellow"/>
+        </w:rPr>
+      </w:pPr>
+      <w:r>
+        <w:rPr>
+          <w:sz w:val="28"/>
+          <w:szCs w:val="28"/>
+          <w:highlight w:val="yellow"/>
+        </w:rPr>
+        <w:t>Paramètre</w:t>
+      </w:r>
+      <w:r>
+        <w:rPr>
+          <w:sz w:val="28"/>
+          <w:szCs w:val="28"/>
+          <w:highlight w:val="yellow"/>
+        </w:rPr>
+        <w:t xml:space="preserve"> 2</w:t>
       </w:r>
     </w:p>
     <w:p>
@@ -250,7 +290,7 @@
           <w:sz w:val="28"/>
           <w:szCs w:val="28"/>
         </w:rPr>
-        <w:t>Calendrier</w:t>
+        <w:t>Barre des tâches</w:t>
       </w:r>
     </w:p>
     <w:p>
@@ -271,7 +311,7 @@
           <w:sz w:val="28"/>
           <w:szCs w:val="28"/>
         </w:rPr>
-        <w:t>Paramètre</w:t>
+        <w:t>Fichier</w:t>
       </w:r>
     </w:p>
     <w:p>
@@ -292,14 +332,7 @@
           <w:sz w:val="28"/>
           <w:szCs w:val="28"/>
         </w:rPr>
-        <w:t>Barre des tâches, menu démarrer</w:t>
-      </w:r>
-      <w:r>
-        <w:rPr>
-          <w:sz w:val="28"/>
-          <w:szCs w:val="28"/>
-        </w:rPr>
-        <w:t xml:space="preserve"> (6%)</w:t>
+        <w:t>Démineur</w:t>
       </w:r>
     </w:p>
     <w:p>
@@ -320,154 +353,14 @@
           <w:sz w:val="28"/>
           <w:szCs w:val="28"/>
         </w:rPr>
-        <w:t>Clic droit</w:t>
-      </w:r>
-    </w:p>
-    <w:p>
-      <w:pPr>
-        <w:pStyle w:val="Paragraphedeliste"/>
-        <w:numPr>
-          <w:ilvl w:val="0"/>
-          <w:numId w:val="1"/>
-        </w:numPr>
-        <w:jc w:val="both"/>
-        <w:rPr>
-          <w:sz w:val="28"/>
-          <w:szCs w:val="28"/>
-        </w:rPr>
-      </w:pPr>
-      <w:r>
-        <w:rPr>
-          <w:sz w:val="28"/>
-          <w:szCs w:val="28"/>
-        </w:rPr>
-        <w:t>Fichier</w:t>
-      </w:r>
-    </w:p>
-    <w:p>
-      <w:pPr>
-        <w:pStyle w:val="Paragraphedeliste"/>
-        <w:numPr>
-          <w:ilvl w:val="0"/>
-          <w:numId w:val="1"/>
-        </w:numPr>
-        <w:jc w:val="both"/>
-        <w:rPr>
-          <w:sz w:val="28"/>
-          <w:szCs w:val="28"/>
-        </w:rPr>
-      </w:pPr>
-      <w:r>
-        <w:rPr>
-          <w:sz w:val="28"/>
-          <w:szCs w:val="28"/>
-        </w:rPr>
-        <w:t>Démineur</w:t>
-      </w:r>
-    </w:p>
-    <w:p>
-      <w:pPr>
-        <w:pStyle w:val="Paragraphedeliste"/>
-        <w:numPr>
-          <w:ilvl w:val="0"/>
-          <w:numId w:val="1"/>
-        </w:numPr>
-        <w:jc w:val="both"/>
-        <w:rPr>
-          <w:sz w:val="28"/>
-          <w:szCs w:val="28"/>
-        </w:rPr>
-      </w:pPr>
-      <w:r>
-        <w:rPr>
-          <w:sz w:val="28"/>
-          <w:szCs w:val="28"/>
-        </w:rPr>
-        <w:t>Tic</w:t>
-      </w:r>
-      <w:r>
-        <w:rPr>
-          <w:sz w:val="28"/>
-          <w:szCs w:val="28"/>
-        </w:rPr>
-        <w:t>-</w:t>
-      </w:r>
-      <w:r>
-        <w:rPr>
-          <w:sz w:val="28"/>
-          <w:szCs w:val="28"/>
-        </w:rPr>
-        <w:t>tac</w:t>
-      </w:r>
-      <w:r>
-        <w:rPr>
-          <w:sz w:val="28"/>
-          <w:szCs w:val="28"/>
-        </w:rPr>
-        <w:t>-</w:t>
-      </w:r>
-      <w:r>
-        <w:rPr>
-          <w:sz w:val="28"/>
-          <w:szCs w:val="28"/>
-        </w:rPr>
-        <w:t xml:space="preserve">toe (avec </w:t>
-      </w:r>
-      <w:r>
-        <w:rPr>
-          <w:sz w:val="28"/>
-          <w:szCs w:val="28"/>
-        </w:rPr>
-        <w:t>IA</w:t>
-      </w:r>
-      <w:r>
-        <w:rPr>
-          <w:sz w:val="28"/>
-          <w:szCs w:val="28"/>
-        </w:rPr>
-        <w:t xml:space="preserve"> ou à 2)</w:t>
-      </w:r>
-    </w:p>
-    <w:p>
-      <w:pPr>
-        <w:pStyle w:val="Paragraphedeliste"/>
-        <w:numPr>
-          <w:ilvl w:val="0"/>
-          <w:numId w:val="1"/>
-        </w:numPr>
-        <w:jc w:val="both"/>
-        <w:rPr>
-          <w:sz w:val="28"/>
-          <w:szCs w:val="28"/>
-        </w:rPr>
-      </w:pPr>
-      <w:r>
-        <w:rPr>
-          <w:sz w:val="28"/>
-          <w:szCs w:val="28"/>
-        </w:rPr>
-        <w:t xml:space="preserve">Puissance 4 (avec </w:t>
-      </w:r>
-      <w:r>
-        <w:rPr>
-          <w:sz w:val="28"/>
-          <w:szCs w:val="28"/>
-        </w:rPr>
-        <w:t>IA</w:t>
-      </w:r>
-      <w:r>
-        <w:rPr>
-          <w:sz w:val="28"/>
-          <w:szCs w:val="28"/>
-        </w:rPr>
-        <w:t xml:space="preserve"> ou à</w:t>
-      </w:r>
-      <w:r>
-        <w:rPr>
-          <w:sz w:val="28"/>
-          <w:szCs w:val="28"/>
-        </w:rPr>
-        <w:t xml:space="preserve"> 2)</w:t>
+        <w:t xml:space="preserve">Puissance </w:t>
+      </w:r>
+      <w:r>
+        <w:rPr>
+          <w:sz w:val="28"/>
+          <w:szCs w:val="28"/>
+        </w:rPr>
+        <w:t>4 (avec IA ou à 2)</w:t>
       </w:r>
     </w:p>
     <w:p>
@@ -715,26 +608,34 @@
           <w:szCs w:val="32"/>
           <w:lang w:val="af-ZA"/>
         </w:rPr>
+        <w:t>Description du projet</w:t>
+      </w:r>
+    </w:p>
+    <w:p>
+      <w:pPr>
+        <w:jc w:val="both"/>
+        <w:rPr>
+          <w:sz w:val="24"/>
+          <w:szCs w:val="24"/>
+          <w:lang w:val="af-ZA"/>
+        </w:rPr>
+      </w:pPr>
+      <w:r>
+        <w:rPr>
+          <w:sz w:val="24"/>
+          <w:szCs w:val="24"/>
+          <w:lang w:val="af-ZA"/>
+        </w:rPr>
+        <w:t xml:space="preserve">Ce projet sera mon portefolio. Lorsque l’on arrive sur la page cela sera comme sur windows mais en simplifié, tout sera propre et bien codé, il y aura pour chacune des applications sont </w:t>
+      </w:r>
+      <w:r>
+        <w:rPr>
+          <w:sz w:val="24"/>
+          <w:szCs w:val="24"/>
+          <w:lang w:val="af-ZA"/>
+        </w:rPr>
         <w:lastRenderedPageBreak/>
-        <w:t>Description du projet</w:t>
-      </w:r>
-    </w:p>
-    <w:p>
-      <w:pPr>
-        <w:jc w:val="both"/>
-        <w:rPr>
-          <w:sz w:val="24"/>
-          <w:szCs w:val="24"/>
-          <w:lang w:val="af-ZA"/>
-        </w:rPr>
-      </w:pPr>
-      <w:r>
-        <w:rPr>
-          <w:sz w:val="24"/>
-          <w:szCs w:val="24"/>
-          <w:lang w:val="af-ZA"/>
-        </w:rPr>
-        <w:t>Ce projet sera mon portefolio. Lorsque l’on arrive sur la page cela sera comme sur windows mais en simplifié, tout sera propre et bien codé, il y aura pour chacune des applications sont icone sur le bureau comme sur windows, l’utilisateurs sera ammené a pouvoir rentrer dans le dossier portefolio ou il y trouvera tout mes projets. Il y aura un fond d’ecran personnalisable.</w:t>
+        <w:t>icone sur le bureau comme sur windows, l’utilisateurs sera ammené a pouvoir rentrer dans le dossier portefolio ou il y trouvera tout mes projets. Il y aura un fond d’ecran personnalisable.</w:t>
       </w:r>
     </w:p>
     <w:p>
@@ -1324,6 +1225,16 @@
     </w:p>
     <w:p>
       <w:pPr>
+        <w:jc w:val="both"/>
+        <w:rPr>
+          <w:sz w:val="24"/>
+          <w:szCs w:val="24"/>
+          <w:lang w:val="af-ZA"/>
+        </w:rPr>
+      </w:pPr>
+    </w:p>
+    <w:p>
+      <w:pPr>
         <w:pStyle w:val="Paragraphedeliste"/>
         <w:numPr>
           <w:ilvl w:val="0"/>
@@ -1342,6 +1253,7 @@
           <w:szCs w:val="28"/>
           <w:lang w:val="af-ZA"/>
         </w:rPr>
+        <w:lastRenderedPageBreak/>
         <w:t>Terminal avec commandes</w:t>
       </w:r>
     </w:p>
@@ -1480,6 +1392,98 @@
           <w:szCs w:val="24"/>
           <w:lang w:val="af-ZA"/>
         </w:rPr>
+        <w:t>Mkdir</w:t>
+      </w:r>
+    </w:p>
+    <w:p>
+      <w:pPr>
+        <w:pStyle w:val="Paragraphedeliste"/>
+        <w:numPr>
+          <w:ilvl w:val="2"/>
+          <w:numId w:val="1"/>
+        </w:numPr>
+        <w:jc w:val="both"/>
+        <w:rPr>
+          <w:sz w:val="28"/>
+          <w:szCs w:val="28"/>
+          <w:lang w:val="af-ZA"/>
+        </w:rPr>
+      </w:pPr>
+      <w:r>
+        <w:rPr>
+          <w:sz w:val="24"/>
+          <w:szCs w:val="24"/>
+          <w:lang w:val="af-ZA"/>
+        </w:rPr>
+        <w:t>Touch</w:t>
+      </w:r>
+    </w:p>
+    <w:p>
+      <w:pPr>
+        <w:pStyle w:val="Paragraphedeliste"/>
+        <w:numPr>
+          <w:ilvl w:val="2"/>
+          <w:numId w:val="1"/>
+        </w:numPr>
+        <w:jc w:val="both"/>
+        <w:rPr>
+          <w:sz w:val="28"/>
+          <w:szCs w:val="28"/>
+          <w:lang w:val="af-ZA"/>
+        </w:rPr>
+      </w:pPr>
+      <w:r>
+        <w:rPr>
+          <w:sz w:val="24"/>
+          <w:szCs w:val="24"/>
+          <w:lang w:val="af-ZA"/>
+        </w:rPr>
+        <w:t>Rm</w:t>
+      </w:r>
+    </w:p>
+    <w:p>
+      <w:pPr>
+        <w:pStyle w:val="Paragraphedeliste"/>
+        <w:numPr>
+          <w:ilvl w:val="2"/>
+          <w:numId w:val="1"/>
+        </w:numPr>
+        <w:jc w:val="both"/>
+        <w:rPr>
+          <w:sz w:val="28"/>
+          <w:szCs w:val="28"/>
+          <w:lang w:val="af-ZA"/>
+        </w:rPr>
+      </w:pPr>
+      <w:r>
+        <w:rPr>
+          <w:sz w:val="24"/>
+          <w:szCs w:val="24"/>
+          <w:lang w:val="af-ZA"/>
+        </w:rPr>
+        <w:t>mv</w:t>
+      </w:r>
+    </w:p>
+    <w:p>
+      <w:pPr>
+        <w:pStyle w:val="Paragraphedeliste"/>
+        <w:numPr>
+          <w:ilvl w:val="2"/>
+          <w:numId w:val="1"/>
+        </w:numPr>
+        <w:jc w:val="both"/>
+        <w:rPr>
+          <w:sz w:val="28"/>
+          <w:szCs w:val="28"/>
+          <w:lang w:val="af-ZA"/>
+        </w:rPr>
+      </w:pPr>
+      <w:r>
+        <w:rPr>
+          <w:sz w:val="24"/>
+          <w:szCs w:val="24"/>
+          <w:lang w:val="af-ZA"/>
+        </w:rPr>
         <w:t>Help</w:t>
       </w:r>
     </w:p>
@@ -1810,30 +1814,92 @@
           <w:szCs w:val="28"/>
           <w:lang w:val="af-ZA"/>
         </w:rPr>
-        <w:t>Lecteur de musique</w:t>
-      </w:r>
-    </w:p>
-    <w:p>
-      <w:pPr>
-        <w:pStyle w:val="Paragraphedeliste"/>
-        <w:numPr>
-          <w:ilvl w:val="1"/>
-          <w:numId w:val="1"/>
-        </w:numPr>
-        <w:jc w:val="both"/>
-        <w:rPr>
-          <w:sz w:val="28"/>
-          <w:szCs w:val="28"/>
-          <w:lang w:val="af-ZA"/>
-        </w:rPr>
-      </w:pPr>
-      <w:r>
-        <w:rPr>
-          <w:sz w:val="24"/>
-          <w:szCs w:val="24"/>
-          <w:lang w:val="af-ZA"/>
-        </w:rPr>
-        <w:t>Jouer avec la balise musique de react</w:t>
+        <w:t>Parametre</w:t>
+      </w:r>
+    </w:p>
+    <w:p>
+      <w:pPr>
+        <w:pStyle w:val="Paragraphedeliste"/>
+        <w:numPr>
+          <w:ilvl w:val="1"/>
+          <w:numId w:val="1"/>
+        </w:numPr>
+        <w:jc w:val="both"/>
+        <w:rPr>
+          <w:sz w:val="28"/>
+          <w:szCs w:val="28"/>
+          <w:lang w:val="af-ZA"/>
+        </w:rPr>
+      </w:pPr>
+      <w:r>
+        <w:rPr>
+          <w:sz w:val="24"/>
+          <w:szCs w:val="24"/>
+          <w:lang w:val="af-ZA"/>
+        </w:rPr>
+        <w:t>T</w:t>
+      </w:r>
+      <w:r>
+        <w:rPr>
+          <w:sz w:val="24"/>
+          <w:szCs w:val="24"/>
+          <w:lang w:val="af-ZA"/>
+        </w:rPr>
+        <w:t>heme clair ou sombre, fond d’ecran, couleur de la bordure des fenetres (la ou on clique pour deplacer la fenetre)</w:t>
+      </w:r>
+    </w:p>
+    <w:p>
+      <w:pPr>
+        <w:pStyle w:val="Paragraphedeliste"/>
+        <w:numPr>
+          <w:ilvl w:val="1"/>
+          <w:numId w:val="1"/>
+        </w:numPr>
+        <w:jc w:val="both"/>
+        <w:rPr>
+          <w:sz w:val="28"/>
+          <w:szCs w:val="28"/>
+          <w:lang w:val="af-ZA"/>
+        </w:rPr>
+      </w:pPr>
+      <w:r>
+        <w:rPr>
+          <w:sz w:val="24"/>
+          <w:szCs w:val="24"/>
+          <w:lang w:val="af-ZA"/>
+        </w:rPr>
+        <w:t>N</w:t>
+      </w:r>
+      <w:r>
+        <w:rPr>
+          <w:sz w:val="24"/>
+          <w:szCs w:val="24"/>
+          <w:lang w:val="af-ZA"/>
+        </w:rPr>
+        <w:t>om de l’utilisateur, date/heure</w:t>
+      </w:r>
+    </w:p>
+    <w:p>
+      <w:pPr>
+        <w:pStyle w:val="Paragraphedeliste"/>
+        <w:numPr>
+          <w:ilvl w:val="1"/>
+          <w:numId w:val="1"/>
+        </w:numPr>
+        <w:jc w:val="both"/>
+        <w:rPr>
+          <w:sz w:val="28"/>
+          <w:szCs w:val="28"/>
+          <w:lang w:val="af-ZA"/>
+        </w:rPr>
+      </w:pPr>
+      <w:r>
+        <w:rPr>
+          <w:sz w:val="24"/>
+          <w:szCs w:val="24"/>
+          <w:lang w:val="af-ZA"/>
+        </w:rPr>
+        <w:t>Parametrer les app dans la barre des taches</w:t>
       </w:r>
     </w:p>
     <w:p>
@@ -1866,40 +1932,38 @@
           <w:szCs w:val="28"/>
           <w:lang w:val="af-ZA"/>
         </w:rPr>
-        <w:t>Calendrier</w:t>
-      </w:r>
-    </w:p>
-    <w:p>
-      <w:pPr>
-        <w:pStyle w:val="Paragraphedeliste"/>
-        <w:numPr>
-          <w:ilvl w:val="1"/>
-          <w:numId w:val="1"/>
-        </w:numPr>
-        <w:jc w:val="both"/>
-        <w:rPr>
-          <w:sz w:val="28"/>
-          <w:szCs w:val="28"/>
-          <w:lang w:val="af-ZA"/>
-        </w:rPr>
-      </w:pPr>
-      <w:r>
-        <w:rPr>
-          <w:sz w:val="24"/>
-          <w:szCs w:val="24"/>
-          <w:lang w:val="af-ZA"/>
-        </w:rPr>
-        <w:t>Ecrire avec IndexedDB, modal avec les modals, plus gros projets, tout recoder sois meme, calendrier simple, une seule vue par mois, avec une grille, probleme a voir sur le moment en fonction de ma determination car chiant</w:t>
-      </w:r>
-    </w:p>
-    <w:p>
-      <w:pPr>
-        <w:pStyle w:val="Paragraphedeliste"/>
-        <w:ind w:left="1440"/>
-        <w:jc w:val="both"/>
-        <w:rPr>
-          <w:sz w:val="28"/>
-          <w:szCs w:val="28"/>
+        <w:t>Barre des taches, menu demarrer</w:t>
+      </w:r>
+    </w:p>
+    <w:p>
+      <w:pPr>
+        <w:pStyle w:val="Paragraphedeliste"/>
+        <w:numPr>
+          <w:ilvl w:val="1"/>
+          <w:numId w:val="1"/>
+        </w:numPr>
+        <w:jc w:val="both"/>
+        <w:rPr>
+          <w:sz w:val="24"/>
+          <w:szCs w:val="24"/>
+          <w:lang w:val="af-ZA"/>
+        </w:rPr>
+      </w:pPr>
+      <w:r>
+        <w:rPr>
+          <w:sz w:val="24"/>
+          <w:szCs w:val="24"/>
+          <w:lang w:val="af-ZA"/>
+        </w:rPr>
+        <w:t>Drag and drop pour deplacer les app, menu demarer avec toutes nos app installés et onglet recherche pour pouvoir les rechercher</w:t>
+      </w:r>
+    </w:p>
+    <w:p>
+      <w:pPr>
+        <w:jc w:val="both"/>
+        <w:rPr>
+          <w:sz w:val="24"/>
+          <w:szCs w:val="24"/>
           <w:lang w:val="af-ZA"/>
         </w:rPr>
       </w:pPr>
@@ -1924,92 +1988,31 @@
           <w:szCs w:val="28"/>
           <w:lang w:val="af-ZA"/>
         </w:rPr>
-        <w:t>Parametre</w:t>
-      </w:r>
-    </w:p>
-    <w:p>
-      <w:pPr>
-        <w:pStyle w:val="Paragraphedeliste"/>
-        <w:numPr>
-          <w:ilvl w:val="1"/>
-          <w:numId w:val="1"/>
-        </w:numPr>
-        <w:jc w:val="both"/>
-        <w:rPr>
-          <w:sz w:val="28"/>
-          <w:szCs w:val="28"/>
-          <w:lang w:val="af-ZA"/>
-        </w:rPr>
-      </w:pPr>
-      <w:r>
-        <w:rPr>
-          <w:sz w:val="24"/>
-          <w:szCs w:val="24"/>
-          <w:lang w:val="af-ZA"/>
-        </w:rPr>
-        <w:t>T</w:t>
-      </w:r>
-      <w:r>
-        <w:rPr>
-          <w:sz w:val="24"/>
-          <w:szCs w:val="24"/>
-          <w:lang w:val="af-ZA"/>
-        </w:rPr>
-        <w:t>heme clair ou sombre, fond d’ecran, couleur de la bordure des fenetres (la ou on clique pour deplacer la fenetre)</w:t>
-      </w:r>
-    </w:p>
-    <w:p>
-      <w:pPr>
-        <w:pStyle w:val="Paragraphedeliste"/>
-        <w:numPr>
-          <w:ilvl w:val="1"/>
-          <w:numId w:val="1"/>
-        </w:numPr>
-        <w:jc w:val="both"/>
-        <w:rPr>
-          <w:sz w:val="28"/>
-          <w:szCs w:val="28"/>
-          <w:lang w:val="af-ZA"/>
-        </w:rPr>
-      </w:pPr>
-      <w:r>
-        <w:rPr>
-          <w:sz w:val="24"/>
-          <w:szCs w:val="24"/>
-          <w:lang w:val="af-ZA"/>
-        </w:rPr>
-        <w:t>N</w:t>
-      </w:r>
-      <w:r>
-        <w:rPr>
-          <w:sz w:val="24"/>
-          <w:szCs w:val="24"/>
-          <w:lang w:val="af-ZA"/>
-        </w:rPr>
-        <w:t>om de l’utilisateur, date/heure</w:t>
-      </w:r>
-    </w:p>
-    <w:p>
-      <w:pPr>
-        <w:pStyle w:val="Paragraphedeliste"/>
-        <w:numPr>
-          <w:ilvl w:val="1"/>
-          <w:numId w:val="1"/>
-        </w:numPr>
-        <w:jc w:val="both"/>
-        <w:rPr>
-          <w:sz w:val="28"/>
-          <w:szCs w:val="28"/>
-          <w:lang w:val="af-ZA"/>
-        </w:rPr>
-      </w:pPr>
-      <w:r>
-        <w:rPr>
-          <w:sz w:val="24"/>
-          <w:szCs w:val="24"/>
-          <w:lang w:val="af-ZA"/>
-        </w:rPr>
-        <w:t>Parametrer les app dans la barre des taches</w:t>
+        <w:lastRenderedPageBreak/>
+        <w:t>Fichier</w:t>
+      </w:r>
+    </w:p>
+    <w:p>
+      <w:pPr>
+        <w:pStyle w:val="Paragraphedeliste"/>
+        <w:numPr>
+          <w:ilvl w:val="1"/>
+          <w:numId w:val="1"/>
+        </w:numPr>
+        <w:jc w:val="both"/>
+        <w:rPr>
+          <w:sz w:val="28"/>
+          <w:szCs w:val="28"/>
+          <w:lang w:val="af-ZA"/>
+        </w:rPr>
+      </w:pPr>
+      <w:r>
+        <w:rPr>
+          <w:sz w:val="24"/>
+          <w:szCs w:val="24"/>
+          <w:lang w:val="af-ZA"/>
+        </w:rPr>
+        <w:t>Objet pouvant etre deplace et ouvert en double clique, avec icone</w:t>
       </w:r>
     </w:p>
     <w:p>
@@ -2042,38 +2045,215 @@
           <w:szCs w:val="28"/>
           <w:lang w:val="af-ZA"/>
         </w:rPr>
-        <w:t>Barre des taches, menu demarrer</w:t>
-      </w:r>
-    </w:p>
-    <w:p>
-      <w:pPr>
-        <w:pStyle w:val="Paragraphedeliste"/>
-        <w:numPr>
-          <w:ilvl w:val="1"/>
-          <w:numId w:val="1"/>
-        </w:numPr>
-        <w:jc w:val="both"/>
-        <w:rPr>
-          <w:sz w:val="24"/>
-          <w:szCs w:val="24"/>
-          <w:lang w:val="af-ZA"/>
-        </w:rPr>
-      </w:pPr>
-      <w:r>
-        <w:rPr>
-          <w:sz w:val="24"/>
-          <w:szCs w:val="24"/>
-          <w:lang w:val="af-ZA"/>
-        </w:rPr>
-        <w:t>Drag and drop pour deplacer les app, menu demarer avec toutes nos app installés et onglet recherche pour pouvoir les rechercher</w:t>
-      </w:r>
-    </w:p>
-    <w:p>
-      <w:pPr>
-        <w:jc w:val="both"/>
-        <w:rPr>
-          <w:sz w:val="24"/>
-          <w:szCs w:val="24"/>
+        <w:t>Puissance 4</w:t>
+      </w:r>
+    </w:p>
+    <w:p>
+      <w:pPr>
+        <w:jc w:val="both"/>
+        <w:rPr>
+          <w:sz w:val="24"/>
+          <w:szCs w:val="24"/>
+          <w:lang w:val="af-ZA"/>
+        </w:rPr>
+      </w:pPr>
+      <w:r>
+        <w:rPr>
+          <w:sz w:val="24"/>
+          <w:szCs w:val="24"/>
+          <w:lang w:val="af-ZA"/>
+        </w:rPr>
+        <w:t>PowerFour/</w:t>
+      </w:r>
+    </w:p>
+    <w:p>
+      <w:pPr>
+        <w:jc w:val="both"/>
+        <w:rPr>
+          <w:sz w:val="24"/>
+          <w:szCs w:val="24"/>
+          <w:lang w:val="af-ZA"/>
+        </w:rPr>
+      </w:pPr>
+      <w:r>
+        <w:rPr>
+          <w:sz w:val="24"/>
+          <w:szCs w:val="24"/>
+          <w:lang w:val="af-ZA"/>
+        </w:rPr>
+        <w:t xml:space="preserve">  PowerFour.tsx      → Bloc 3 (interface globale) + Bloc 4 (orchestration)</w:t>
+      </w:r>
+    </w:p>
+    <w:p>
+      <w:pPr>
+        <w:jc w:val="both"/>
+        <w:rPr>
+          <w:sz w:val="24"/>
+          <w:szCs w:val="24"/>
+          <w:lang w:val="af-ZA"/>
+        </w:rPr>
+      </w:pPr>
+      <w:r>
+        <w:rPr>
+          <w:sz w:val="24"/>
+          <w:szCs w:val="24"/>
+          <w:lang w:val="af-ZA"/>
+        </w:rPr>
+        <w:t xml:space="preserve">  Board.tsx          → Bloc 3 (affichage plateau)</w:t>
+      </w:r>
+    </w:p>
+    <w:p>
+      <w:pPr>
+        <w:jc w:val="both"/>
+        <w:rPr>
+          <w:sz w:val="24"/>
+          <w:szCs w:val="24"/>
+          <w:lang w:val="af-ZA"/>
+        </w:rPr>
+      </w:pPr>
+      <w:r>
+        <w:rPr>
+          <w:sz w:val="24"/>
+          <w:szCs w:val="24"/>
+          <w:lang w:val="af-ZA"/>
+        </w:rPr>
+        <w:t xml:space="preserve">  engine.ts          → Bloc 1 (règles pures)</w:t>
+      </w:r>
+    </w:p>
+    <w:p>
+      <w:pPr>
+        <w:jc w:val="both"/>
+        <w:rPr>
+          <w:sz w:val="24"/>
+          <w:szCs w:val="24"/>
+          <w:lang w:val="af-ZA"/>
+        </w:rPr>
+      </w:pPr>
+      <w:r>
+        <w:rPr>
+          <w:sz w:val="24"/>
+          <w:szCs w:val="24"/>
+          <w:lang w:val="af-ZA"/>
+        </w:rPr>
+        <w:t xml:space="preserve">  store.ts           → Bloc 2 (état Zustand)</w:t>
+      </w:r>
+    </w:p>
+    <w:p>
+      <w:pPr>
+        <w:jc w:val="both"/>
+        <w:rPr>
+          <w:sz w:val="24"/>
+          <w:szCs w:val="24"/>
+          <w:lang w:val="af-ZA"/>
+        </w:rPr>
+      </w:pPr>
+      <w:r>
+        <w:rPr>
+          <w:sz w:val="24"/>
+          <w:szCs w:val="24"/>
+          <w:lang w:val="af-ZA"/>
+        </w:rPr>
+        <w:t xml:space="preserve">  ai.ts              → Bloc 5 (IA)</w:t>
+      </w:r>
+    </w:p>
+    <w:p>
+      <w:pPr>
+        <w:jc w:val="both"/>
+        <w:rPr>
+          <w:sz w:val="24"/>
+          <w:szCs w:val="24"/>
+          <w:lang w:val="af-ZA"/>
+        </w:rPr>
+      </w:pPr>
+      <w:r>
+        <w:rPr>
+          <w:sz w:val="24"/>
+          <w:szCs w:val="24"/>
+          <w:lang w:val="af-ZA"/>
+        </w:rPr>
+        <w:t xml:space="preserve">  networkClient.ts   → Bloc 6 (réseau client)</w:t>
+      </w:r>
+    </w:p>
+    <w:p>
+      <w:pPr>
+        <w:jc w:val="both"/>
+        <w:rPr>
+          <w:sz w:val="24"/>
+          <w:szCs w:val="24"/>
+          <w:lang w:val="af-ZA"/>
+        </w:rPr>
+      </w:pPr>
+    </w:p>
+    <w:p>
+      <w:pPr>
+        <w:jc w:val="both"/>
+        <w:rPr>
+          <w:sz w:val="24"/>
+          <w:szCs w:val="24"/>
+          <w:lang w:val="af-ZA"/>
+        </w:rPr>
+      </w:pPr>
+      <w:r>
+        <w:rPr>
+          <w:sz w:val="24"/>
+          <w:szCs w:val="24"/>
+          <w:lang w:val="af-ZA"/>
+        </w:rPr>
+        <w:t>serveur séparé (hors app React) :</w:t>
+      </w:r>
+    </w:p>
+    <w:p>
+      <w:pPr>
+        <w:jc w:val="both"/>
+        <w:rPr>
+          <w:sz w:val="24"/>
+          <w:szCs w:val="24"/>
+          <w:lang w:val="af-ZA"/>
+        </w:rPr>
+      </w:pPr>
+      <w:r>
+        <w:rPr>
+          <w:sz w:val="24"/>
+          <w:szCs w:val="24"/>
+          <w:lang w:val="af-ZA"/>
+        </w:rPr>
+        <w:t xml:space="preserve">  server.py          → Bloc 7 (relais + validation du tour)</w:t>
+      </w:r>
+    </w:p>
+    <w:p>
+      <w:pPr>
+        <w:jc w:val="both"/>
+        <w:rPr>
+          <w:sz w:val="24"/>
+          <w:szCs w:val="24"/>
+          <w:lang w:val="af-ZA"/>
+        </w:rPr>
+      </w:pPr>
+    </w:p>
+    <w:p>
+      <w:pPr>
+        <w:jc w:val="both"/>
+        <w:rPr>
+          <w:sz w:val="24"/>
+          <w:szCs w:val="24"/>
+          <w:lang w:val="af-ZA"/>
+        </w:rPr>
+      </w:pPr>
+      <w:r>
+        <w:rPr>
+          <w:sz w:val="24"/>
+          <w:szCs w:val="24"/>
+          <w:lang w:val="af-ZA"/>
+        </w:rPr>
+        <w:t>Bloc 8 (cas limites) → réparti dans store.ts, networkClient.ts, server.py, PowerFour.tsx</w:t>
+      </w:r>
+    </w:p>
+    <w:p>
+      <w:pPr>
+        <w:jc w:val="both"/>
+        <w:rPr>
+          <w:sz w:val="28"/>
+          <w:szCs w:val="28"/>
           <w:lang w:val="af-ZA"/>
         </w:rPr>
       </w:pPr>
@@ -2098,174 +2278,6 @@
           <w:szCs w:val="28"/>
           <w:lang w:val="af-ZA"/>
         </w:rPr>
-        <w:t>Clic droit</w:t>
-      </w:r>
-    </w:p>
-    <w:p>
-      <w:pPr>
-        <w:pStyle w:val="Paragraphedeliste"/>
-        <w:numPr>
-          <w:ilvl w:val="1"/>
-          <w:numId w:val="1"/>
-        </w:numPr>
-        <w:jc w:val="both"/>
-        <w:rPr>
-          <w:sz w:val="28"/>
-          <w:szCs w:val="28"/>
-          <w:lang w:val="af-ZA"/>
-        </w:rPr>
-      </w:pPr>
-      <w:r>
-        <w:rPr>
-          <w:sz w:val="24"/>
-          <w:szCs w:val="24"/>
-          <w:lang w:val="af-ZA"/>
-        </w:rPr>
-        <w:t>Detecte la ou on clique, en fonction afficher certaines options avec certaines commandes</w:t>
-      </w:r>
-    </w:p>
-    <w:p>
-      <w:pPr>
-        <w:jc w:val="both"/>
-        <w:rPr>
-          <w:sz w:val="28"/>
-          <w:szCs w:val="28"/>
-          <w:lang w:val="af-ZA"/>
-        </w:rPr>
-      </w:pPr>
-    </w:p>
-    <w:p>
-      <w:pPr>
-        <w:pStyle w:val="Paragraphedeliste"/>
-        <w:numPr>
-          <w:ilvl w:val="0"/>
-          <w:numId w:val="1"/>
-        </w:numPr>
-        <w:jc w:val="both"/>
-        <w:rPr>
-          <w:sz w:val="28"/>
-          <w:szCs w:val="28"/>
-          <w:lang w:val="af-ZA"/>
-        </w:rPr>
-      </w:pPr>
-      <w:r>
-        <w:rPr>
-          <w:sz w:val="28"/>
-          <w:szCs w:val="28"/>
-          <w:lang w:val="af-ZA"/>
-        </w:rPr>
-        <w:t>Fichier</w:t>
-      </w:r>
-    </w:p>
-    <w:p>
-      <w:pPr>
-        <w:pStyle w:val="Paragraphedeliste"/>
-        <w:numPr>
-          <w:ilvl w:val="1"/>
-          <w:numId w:val="1"/>
-        </w:numPr>
-        <w:jc w:val="both"/>
-        <w:rPr>
-          <w:sz w:val="28"/>
-          <w:szCs w:val="28"/>
-          <w:lang w:val="af-ZA"/>
-        </w:rPr>
-      </w:pPr>
-      <w:r>
-        <w:rPr>
-          <w:sz w:val="24"/>
-          <w:szCs w:val="24"/>
-          <w:lang w:val="af-ZA"/>
-        </w:rPr>
-        <w:t>Objet pouvant etre deplace et ouvert en double clique, avec icone</w:t>
-      </w:r>
-    </w:p>
-    <w:p>
-      <w:pPr>
-        <w:jc w:val="both"/>
-        <w:rPr>
-          <w:sz w:val="28"/>
-          <w:szCs w:val="28"/>
-          <w:lang w:val="af-ZA"/>
-        </w:rPr>
-      </w:pPr>
-    </w:p>
-    <w:p>
-      <w:pPr>
-        <w:pStyle w:val="Paragraphedeliste"/>
-        <w:numPr>
-          <w:ilvl w:val="0"/>
-          <w:numId w:val="1"/>
-        </w:numPr>
-        <w:jc w:val="both"/>
-        <w:rPr>
-          <w:sz w:val="28"/>
-          <w:szCs w:val="28"/>
-          <w:lang w:val="af-ZA"/>
-        </w:rPr>
-      </w:pPr>
-      <w:r>
-        <w:rPr>
-          <w:sz w:val="28"/>
-          <w:szCs w:val="28"/>
-          <w:lang w:val="af-ZA"/>
-        </w:rPr>
-        <w:t>Jeu</w:t>
-      </w:r>
-    </w:p>
-    <w:p>
-      <w:pPr>
-        <w:pStyle w:val="Paragraphedeliste"/>
-        <w:numPr>
-          <w:ilvl w:val="1"/>
-          <w:numId w:val="1"/>
-        </w:numPr>
-        <w:jc w:val="both"/>
-        <w:rPr>
-          <w:sz w:val="28"/>
-          <w:szCs w:val="28"/>
-          <w:lang w:val="af-ZA"/>
-        </w:rPr>
-      </w:pPr>
-      <w:r>
-        <w:rPr>
-          <w:sz w:val="24"/>
-          <w:szCs w:val="24"/>
-          <w:lang w:val="af-ZA"/>
-        </w:rPr>
-        <w:t>Recoder le jeux, facile a faire normalement, se documenter pour l’utilisation de l’ia ou pour la coder sois meme en ts / web socket pour jouer avec quelqu’un d’autres</w:t>
-      </w:r>
-    </w:p>
-    <w:p>
-      <w:pPr>
-        <w:jc w:val="both"/>
-        <w:rPr>
-          <w:sz w:val="28"/>
-          <w:szCs w:val="28"/>
-          <w:lang w:val="af-ZA"/>
-        </w:rPr>
-      </w:pPr>
-    </w:p>
-    <w:p>
-      <w:pPr>
-        <w:pStyle w:val="Paragraphedeliste"/>
-        <w:numPr>
-          <w:ilvl w:val="0"/>
-          <w:numId w:val="1"/>
-        </w:numPr>
-        <w:jc w:val="both"/>
-        <w:rPr>
-          <w:sz w:val="28"/>
-          <w:szCs w:val="28"/>
-          <w:lang w:val="af-ZA"/>
-        </w:rPr>
-      </w:pPr>
-      <w:r>
-        <w:rPr>
-          <w:sz w:val="28"/>
-          <w:szCs w:val="28"/>
-          <w:lang w:val="af-ZA"/>
-        </w:rPr>
         <w:t>Calculatrice</w:t>
       </w:r>
     </w:p>
@@ -2289,17 +2301,53 @@
           <w:szCs w:val="24"/>
           <w:lang w:val="af-ZA"/>
         </w:rPr>
-        <w:t>Utilise un algo avec des piles ou de la recursivité</w:t>
-      </w:r>
-    </w:p>
-    <w:p>
-      <w:pPr>
-        <w:rPr>
-          <w:sz w:val="24"/>
-          <w:szCs w:val="24"/>
-          <w:lang w:val="af-ZA"/>
-        </w:rPr>
-      </w:pPr>
+        <w:t>U</w:t>
+      </w:r>
+      <w:r>
+        <w:rPr>
+          <w:sz w:val="24"/>
+          <w:szCs w:val="24"/>
+          <w:lang w:val="af-ZA"/>
+        </w:rPr>
+        <w:t>tilise</w:t>
+      </w:r>
+      <w:r>
+        <w:t xml:space="preserve"> </w:t>
+      </w:r>
+      <w:r>
+        <w:rPr>
+          <w:sz w:val="24"/>
+          <w:szCs w:val="24"/>
+        </w:rPr>
+        <w:t xml:space="preserve">l'algorithme </w:t>
+      </w:r>
+      <w:proofErr w:type="spellStart"/>
+      <w:r>
+        <w:rPr>
+          <w:b/>
+          <w:bCs/>
+          <w:sz w:val="24"/>
+          <w:szCs w:val="24"/>
+        </w:rPr>
+        <w:t>Shunting</w:t>
+      </w:r>
+      <w:proofErr w:type="spellEnd"/>
+      <w:r>
+        <w:rPr>
+          <w:b/>
+          <w:bCs/>
+          <w:sz w:val="24"/>
+          <w:szCs w:val="24"/>
+        </w:rPr>
+        <w:t>-yard</w:t>
+      </w:r>
+      <w:r>
+        <w:rPr>
+          <w:sz w:val="24"/>
+          <w:szCs w:val="24"/>
+        </w:rPr>
+        <w:t xml:space="preserve"> de Dijkstra</w:t>
+      </w:r>
       <w:r>
         <w:rPr>
           <w:sz w:val="24"/>
@@ -3357,7 +3405,7 @@
 </file>
 
 <file path=word/numbering.xml><?xml version="1.0" encoding="utf-8"?>
-<w:numbering xmlns:wpc="http://schemas.microsoft.com/office/word/2010/wordprocessingCanvas" xmlns:cx="http://schemas.microsoft.com/office/drawing/2014/chartex" xmlns:cx1="http://schemas.microsoft.com/office/drawing/2015/9/8/chartex" xmlns:cx2="http://schemas.microsoft.com/office/drawing/2015/10/21/chartex" xmlns:cx3="http://schemas.microsoft.com/office/drawing/2016/5/9/chartex" xmlns:cx4="http://schemas.microsoft.com/office/drawing/2016/5/10/chartex" xmlns:cx5="http://schemas.microsoft.com/office/drawing/2016/5/11/chartex" xmlns:cx6="http://schemas.microsoft.com/office/drawing/2016/5/12/chartex" xmlns:cx7="http://schemas.microsoft.com/office/drawing/2016/5/13/chartex" xmlns:cx8="http://schemas.microsoft.com/office/drawing/2016/5/14/chartex" xmlns:mc="http://schemas.openxmlformats.org/markup-compatibility/2006" xmlns:aink="http://schemas.microsoft.com/office/drawing/2016/ink" xmlns:am3d="http://schemas.microsoft.com/office/drawing/2017/model3d" xmlns:o="urn:schemas-microsoft-com:office:office" xmlns:oel="http://schemas.microsoft.com/office/2019/extlst" xmlns:r="http://schemas.openxmlformats.org/officeDocument/2006/relationships" xmlns:m="http://schemas.openxmlformats.org/officeDocument/2006/math" xmlns:v="urn:schemas-microsoft-com:vml" xmlns:wp14="http://schemas.microsoft.com/office/word/2010/wordprocessingDrawing" xmlns:wp="http://schemas.openxmlformats.org/drawingml/2006/wordprocessingDrawing" xmlns:w10="urn:schemas-microsoft-com:office:word" xmlns:w="http://schemas.openxmlformats.org/wordprocessingml/2006/main" xmlns:w14="http://schemas.microsoft.com/office/word/2010/wordml" xmlns:w15="http://schemas.microsoft.com/office/word/2012/wordml" xmlns:w16cex="http://schemas.microsoft.com/office/word/2018/wordml/cex" xmlns:w16cid="http://schemas.microsoft.com/office/word/2016/wordml/cid" xmlns:w16="http://schemas.microsoft.com/office/word/2018/wordml" xmlns:w16du="http://schemas.microsoft.com/office/word/2023/wordml/word16du" xmlns:w16sdtdh="http://schemas.microsoft.com/office/word/2020/wordml/sdtdatahash" xmlns:w16sdtfl="http://schemas.microsoft.com/office/word/2024/wordml/sdtformatlock" xmlns:w16se="http://schemas.microsoft.com/office/word/2015/wordml/symex" xmlns:wpg="http://schemas.microsoft.com/office/word/2010/wordprocessingGroup" xmlns:wpi="http://schemas.microsoft.com/office/word/2010/wordprocessingInk" xmlns:wne="http://schemas.microsoft.com/office/word/2006/wordml" xmlns:wps="http://schemas.microsoft.com/office/word/2010/wordprocessingShape" mc:Ignorable="w14 w15 w16se w16cid w16 w16cex w16sdtdh w16sdtfl w16du wp14">
+<w:numbering xmlns:wpc="http://schemas.microsoft.com/office/word/2010/wordprocessingCanvas" xmlns:cx="http://schemas.microsoft.com/office/drawing/2014/chartex" xmlns:cx1="http://schemas.microsoft.com/office/drawing/2015/9/8/chartex" xmlns:cx2="http://schemas.microsoft.com/office/drawing/2015/10/21/chartex" xmlns:cx3="http://schemas.microsoft.com/office/drawing/2016/5/9/chartex" xmlns:cx4="http://schemas.microsoft.com/office/drawing/2016/5/10/chartex" xmlns:cx5="http://schemas.microsoft.com/office/drawing/2016/5/11/chartex" xmlns:cx6="http://schemas.microsoft.com/office/drawing/2016/5/12/chartex" xmlns:cx7="http://schemas.microsoft.com/office/drawing/2016/5/13/chartex" xmlns:cx8="http://schemas.microsoft.com/office/drawing/2016/5/14/chartex" xmlns:mc="http://schemas.openxmlformats.org/markup-compatibility/2006" xmlns:aink="http://schemas.microsoft.com/office/drawing/2016/ink" xmlns:am3d="http://schemas.microsoft.com/office/drawing/2017/model3d" xmlns:o="urn:schemas-microsoft-com:office:office" xmlns:oel="http://schemas.microsoft.com/office/2019/extlst" xmlns:r="http://schemas.openxmlformats.org/officeDocument/2006/relationships" xmlns:m="http://schemas.openxmlformats.org/officeDocument/2006/math" xmlns:v="urn:schemas-microsoft-com:vml" xmlns:wp14="http://schemas.microsoft.com/office/word/2010/wordprocessingDrawing" xmlns:wp="http://schemas.openxmlformats.org/drawingml/2006/wordprocessingDrawing" xmlns:w10="urn:schemas-microsoft-com:office:word" xmlns:w="http://schemas.openxmlformats.org/wordprocessingml/2006/main" xmlns:w14="http://schemas.microsoft.com/office/word/2010/wordml" xmlns:w15="http://schemas.microsoft.com/office/word/2012/wordml" xmlns:w16cei="http://schemas.microsoft.com/office/word/2026/wordml/cei" xmlns:w16cex="http://schemas.microsoft.com/office/word/2018/wordml/cex" xmlns:w16cid="http://schemas.microsoft.com/office/word/2016/wordml/cid" xmlns:w16="http://schemas.microsoft.com/office/word/2018/wordml" xmlns:w16du="http://schemas.microsoft.com/office/word/2023/wordml/word16du" xmlns:w16sdtdh="http://schemas.microsoft.com/office/word/2020/wordml/sdtdatahash" xmlns:w16sdtfl="http://schemas.microsoft.com/office/word/2024/wordml/sdtformatlock" xmlns:w16se="http://schemas.microsoft.com/office/word/2015/wordml/symex" xmlns:wpg="http://schemas.microsoft.com/office/word/2010/wordprocessingGroup" xmlns:wpi="http://schemas.microsoft.com/office/word/2010/wordprocessingInk" xmlns:wne="http://schemas.microsoft.com/office/word/2006/wordml" xmlns:wps="http://schemas.microsoft.com/office/word/2010/wordprocessingShape" mc:Ignorable="w14 w15 w16se w16cid w16 w16cex w16sdtdh w16sdtfl w16du wp14">
   <w:abstractNum w:abstractNumId="0" w15:restartNumberingAfterBreak="0">
     <w:nsid w:val="56832E41"/>
     <w:multiLevelType w:val="hybridMultilevel"/>

</xml_diff>